<commit_message>
changes of connection summary doc
</commit_message>
<xml_diff>
--- a/Documents/sensor connection.docx
+++ b/Documents/sensor connection.docx
@@ -1199,16 +1199,8 @@
         <w:pStyle w:val="Heading1"/>
       </w:pPr>
       <w:r>
-        <w:t>Rain Detection</w:t>
-      </w:r>
-      <w:r>
-        <w:t xml:space="preserve"> </w:t>
-      </w:r>
-      <w:proofErr w:type="gramStart"/>
-      <w:r>
-        <w:t>sensor connection</w:t>
-      </w:r>
-      <w:proofErr w:type="gramEnd"/>
+        <w:t>Rain Detection sensor connection</w:t>
+      </w:r>
     </w:p>
     <w:tbl>
       <w:tblPr>
@@ -2213,6 +2205,9 @@
     <w:p/>
     <w:p>
       <w:r>
+        <w:rPr>
+          <w:noProof/>
+        </w:rPr>
         <w:drawing>
           <wp:inline distT="0" distB="0" distL="0" distR="0" wp14:anchorId="4DEC3CBB" wp14:editId="7AE2BB34">
             <wp:extent cx="4791744" cy="1590897"/>
@@ -2251,21 +2246,12 @@
       </w:r>
     </w:p>
     <w:p>
-      <w:proofErr w:type="gramStart"/>
       <w:r>
         <w:rPr>
           <w:b/>
           <w:bCs/>
         </w:rPr>
-        <w:t>Step-by-step</w:t>
-      </w:r>
-      <w:proofErr w:type="gramEnd"/>
-      <w:r>
-        <w:rPr>
-          <w:b/>
-          <w:bCs/>
-        </w:rPr>
-        <w:t>:</w:t>
+        <w:t>Step-by-step:</w:t>
       </w:r>
     </w:p>
     <w:p>
@@ -2340,13 +2326,8 @@
           <w:numId w:val="1"/>
         </w:numPr>
       </w:pPr>
-      <w:proofErr w:type="gramStart"/>
-      <w:r>
-        <w:t>Other</w:t>
-      </w:r>
-      <w:proofErr w:type="gramEnd"/>
-      <w:r>
-        <w:t xml:space="preserve"> end of 2kΩ → Raspberry Pi </w:t>
+      <w:r>
+        <w:t>Other end of 2kΩ → Raspberry Pi </w:t>
       </w:r>
       <w:r>
         <w:rPr>
@@ -2357,6 +2338,11 @@
       </w:r>
     </w:p>
     <w:p/>
+    <w:p>
+      <w:r>
+        <w:t>NEMA 17 Motor</w:t>
+      </w:r>
+    </w:p>
     <w:sectPr>
       <w:pgSz w:w="12240" w:h="15840"/>
       <w:pgMar w:top="1440" w:right="1440" w:bottom="1440" w:left="1440" w:header="720" w:footer="720" w:gutter="0"/>
@@ -3149,6 +3135,7 @@
   <w:style w:type="character" w:default="1" w:styleId="DefaultParagraphFont">
     <w:name w:val="Default Paragraph Font"/>
     <w:uiPriority w:val="1"/>
+    <w:semiHidden/>
     <w:unhideWhenUsed/>
   </w:style>
   <w:style w:type="table" w:default="1" w:styleId="TableNormal">

</xml_diff>

<commit_message>
dataset creation codes, CWR requirement stacked model codes and the CWR dataset
</commit_message>
<xml_diff>
--- a/Documents/sensor connection.docx
+++ b/Documents/sensor connection.docx
@@ -2405,7 +2405,21 @@
           <w:bCs/>
         </w:rPr>
         <w:lastRenderedPageBreak/>
-        <w:t>A4988 Stepper Motor Driver Pin Connections</w:t>
+        <w:t xml:space="preserve">A4988 </w:t>
+      </w:r>
+      <w:r>
+        <w:rPr>
+          <w:b/>
+          <w:bCs/>
+        </w:rPr>
+        <w:t xml:space="preserve">NEMA 17 </w:t>
+      </w:r>
+      <w:r>
+        <w:rPr>
+          <w:b/>
+          <w:bCs/>
+        </w:rPr>
+        <w:t>Stepper Motor Driver Pin Connections</w:t>
       </w:r>
     </w:p>
     <w:p>
@@ -4032,16 +4046,36 @@
         <w:t>STEP controls movement</w:t>
       </w:r>
       <w:r>
-        <w:t>: Each pulse = one step (or microstep)[</w:t>
-      </w:r>
-      <w:hyperlink r:id="rId10" w:history="1">
-        <w:r>
-          <w:rPr>
-            <w:rStyle w:val="Hyperlink"/>
-          </w:rPr>
-          <w:t>aranacorp</w:t>
-        </w:r>
-      </w:hyperlink>
+        <w:t xml:space="preserve">: Each pulse = one step (or </w:t>
+      </w:r>
+      <w:proofErr w:type="spellStart"/>
+      <w:r>
+        <w:t>microstep</w:t>
+      </w:r>
+      <w:proofErr w:type="spellEnd"/>
+      <w:r>
+        <w:t>)[</w:t>
+      </w:r>
+      <w:proofErr w:type="spellStart"/>
+      <w:r>
+        <w:fldChar w:fldCharType="begin"/>
+      </w:r>
+      <w:r>
+        <w:instrText>HYPERLINK "https://www.aranacorp.com/en/using-an-a4988-stepper-motor-driver/"</w:instrText>
+      </w:r>
+      <w:r>
+        <w:fldChar w:fldCharType="separate"/>
+      </w:r>
+      <w:r>
+        <w:rPr>
+          <w:rStyle w:val="Hyperlink"/>
+        </w:rPr>
+        <w:t>aranacorp</w:t>
+      </w:r>
+      <w:proofErr w:type="spellEnd"/>
+      <w:r>
+        <w:fldChar w:fldCharType="end"/>
+      </w:r>
       <w:r>
         <w:t>]</w:t>
       </w:r>
@@ -4070,14 +4104,26 @@
       <w:r>
         <w:t>: Optional - if not connected, motor is always enabled[</w:t>
       </w:r>
-      <w:hyperlink r:id="rId11" w:history="1">
-        <w:r>
-          <w:rPr>
-            <w:rStyle w:val="Hyperlink"/>
-          </w:rPr>
-          <w:t>steppermotor</w:t>
-        </w:r>
-      </w:hyperlink>
+      <w:proofErr w:type="spellStart"/>
+      <w:r>
+        <w:fldChar w:fldCharType="begin"/>
+      </w:r>
+      <w:r>
+        <w:instrText>HYPERLINK "https://steppermotor.net/control-stepper-motor-with-raspberry-pi/"</w:instrText>
+      </w:r>
+      <w:r>
+        <w:fldChar w:fldCharType="separate"/>
+      </w:r>
+      <w:r>
+        <w:rPr>
+          <w:rStyle w:val="Hyperlink"/>
+        </w:rPr>
+        <w:t>steppermotor</w:t>
+      </w:r>
+      <w:proofErr w:type="spellEnd"/>
+      <w:r>
+        <w:fldChar w:fldCharType="end"/>
+      </w:r>
       <w:r>
         <w:t>]</w:t>
       </w:r>
@@ -4096,7 +4142,7 @@
         </w:rPr>
         <w:t>Save these connections for future reference!</w:t>
       </w:r>
-      <w:hyperlink r:id="rId12" w:tgtFrame="_blank" w:history="1">
+      <w:hyperlink r:id="rId10" w:tgtFrame="_blank" w:history="1">
         <w:r>
           <w:rPr>
             <w:rStyle w:val="Hyperlink"/>

</xml_diff>